<commit_message>
feat: Github workflow to publish packages
</commit_message>
<xml_diff>
--- a/docs/CTC_MD_01_05_proposta_tfm.docx
+++ b/docs/CTC_MD_01_05_proposta_tfm.docx
@@ -739,7 +739,133 @@
                 <w:szCs w:val="18"/>
                 <w:lang w:val="pt-PT"/>
               </w:rPr>
-              <w:t xml:space="preserve"> D □ TP □ ENP □</w:t>
+              <w:t xml:space="preserve"> D </w:t>
+            </w:r>
+            <w:r/>
+            <w:sdt>
+              <w:sdtPr>
+                <w:alias w:val=""/>
+                <w:tag w:val=""/>
+                <w15:appearance w15:val="boundingBox"/>
+                <w:lock w:val="unlocked"/>
+                <w14:checkbox>
+                  <w14:checked w14:val="0"/>
+                  <w14:checkedState w14:val="2612" w14:font="MS Gothic"/>
+                  <w14:uncheckedState w14:val="2610" w14:font="MS Gothic"/>
+                </w14:checkbox>
+                <w:rPr>
+                  <w:rFonts w:ascii="Verdana" w:hAnsi="Verdana" w:cs="Calibri"/>
+                  <w:smallCaps/>
+                  <w:sz w:val="18"/>
+                  <w:szCs w:val="18"/>
+                  <w:lang w:val="pt-PT"/>
+                </w:rPr>
+              </w:sdtPr>
+              <w:sdtContent>
+                <w:r>
+                  <w:rPr>
+                    <w:rFonts w:ascii="MS Gothic" w:hAnsi="MS Gothic" w:eastAsia="MS Gothic" w:cs="MS Gothic"/>
+                    <w:smallCaps/>
+                    <w:sz w:val="18"/>
+                    <w:szCs w:val="18"/>
+                    <w:lang w:val="pt-PT"/>
+                  </w:rPr>
+                  <w:t xml:space="preserve">☐</w:t>
+                </w:r>
+              </w:sdtContent>
+            </w:sdt>
+            <w:r/>
+            <w:r>
+              <w:rPr>
+                <w:rFonts w:ascii="Verdana" w:hAnsi="Verdana" w:cs="Calibri"/>
+                <w:smallCaps/>
+                <w:sz w:val="18"/>
+                <w:szCs w:val="18"/>
+                <w:lang w:val="pt-PT"/>
+              </w:rPr>
+              <w:t xml:space="preserve"> TP </w:t>
+            </w:r>
+            <w:r/>
+            <w:sdt>
+              <w:sdtPr>
+                <w:alias w:val=""/>
+                <w:tag w:val=""/>
+                <w15:appearance w15:val="boundingBox"/>
+                <w:lock w:val="unlocked"/>
+                <w14:checkbox>
+                  <w14:checked w14:val="1"/>
+                  <w14:checkedState w14:val="2612" w14:font="MS Gothic"/>
+                  <w14:uncheckedState w14:val="2610" w14:font="MS Gothic"/>
+                </w14:checkbox>
+                <w:rPr>
+                  <w:rFonts w:ascii="Verdana" w:hAnsi="Verdana" w:cs="Calibri"/>
+                  <w:smallCaps/>
+                  <w:sz w:val="18"/>
+                  <w:szCs w:val="18"/>
+                  <w:lang w:val="pt-PT"/>
+                </w:rPr>
+              </w:sdtPr>
+              <w:sdtContent>
+                <w:r>
+                  <w:rPr>
+                    <w:rFonts w:ascii="MS Gothic" w:hAnsi="MS Gothic" w:eastAsia="MS Gothic" w:cs="MS Gothic"/>
+                    <w:smallCaps/>
+                    <w:sz w:val="18"/>
+                    <w:szCs w:val="18"/>
+                    <w:lang w:val="pt-PT"/>
+                  </w:rPr>
+                  <w:t xml:space="preserve">☒</w:t>
+                </w:r>
+              </w:sdtContent>
+            </w:sdt>
+            <w:r/>
+            <w:r>
+              <w:rPr>
+                <w:rFonts w:ascii="Verdana" w:hAnsi="Verdana" w:cs="Calibri"/>
+                <w:smallCaps/>
+                <w:sz w:val="18"/>
+                <w:szCs w:val="18"/>
+                <w:lang w:val="pt-PT"/>
+              </w:rPr>
+              <w:t xml:space="preserve"> ENP</w:t>
+            </w:r>
+            <w:sdt>
+              <w:sdtPr>
+                <w15:appearance w15:val="boundingBox"/>
+                <w14:checkbox>
+                  <w14:checked w14:val="0"/>
+                  <w14:checkedState w14:val="2612" w14:font="MS Gothic"/>
+                  <w14:uncheckedState w14:val="2610" w14:font="MS Gothic"/>
+                </w14:checkbox>
+                <w:rPr>
+                  <w:rFonts w:ascii="Verdana" w:hAnsi="Verdana" w:cs="Calibri"/>
+                  <w:smallCaps/>
+                  <w:sz w:val="18"/>
+                  <w:szCs w:val="18"/>
+                  <w:lang w:val="pt-PT"/>
+                </w:rPr>
+              </w:sdtPr>
+              <w:sdtContent>
+                <w:r>
+                  <w:rPr>
+                    <w:rFonts w:ascii="MS Gothic" w:hAnsi="MS Gothic" w:eastAsia="MS Gothic" w:cs="MS Gothic"/>
+                    <w:smallCaps/>
+                    <w:sz w:val="18"/>
+                    <w:szCs w:val="18"/>
+                    <w:lang w:val="pt-PT"/>
+                  </w:rPr>
+                  <w:t xml:space="preserve">☐</w:t>
+                </w:r>
+              </w:sdtContent>
+            </w:sdt>
+            <w:r>
+              <w:rPr>
+                <w:rFonts w:ascii="Verdana" w:hAnsi="Verdana" w:cs="Calibri"/>
+                <w:smallCaps/>
+                <w:sz w:val="18"/>
+                <w:szCs w:val="18"/>
+                <w:lang w:val="pt-PT"/>
+              </w:rPr>
             </w:r>
             <w:r>
               <w:rPr>
@@ -1253,7 +1379,7 @@
                 <w:szCs w:val="18"/>
                 <w:lang w:val="en-US"/>
               </w:rPr>
-              <w:t xml:space="preserve">José Simão</w:t>
+              <w:t xml:space="preserve">José Manuel de Campos Lages Garcia Simão</w:t>
             </w:r>
             <w:r>
               <w:rPr>
@@ -1294,8 +1420,10 @@
                 <w:smallCaps/>
                 <w:sz w:val="18"/>
                 <w:szCs w:val="18"/>
-                <w:lang w:val="pt-PT"/>
+                <w:lang w:val="en-US"/>
               </w:rPr>
+              <w:t xml:space="preserve">D
+</w:t>
             </w:r>
             <w:r>
               <w:rPr>

</xml_diff>